<commit_message>
Inluded a target address calculator for JAL type instructions in fetch, and another for branch and JALR in issue stage. Now branches are assumed not taken in decode.
</commit_message>
<xml_diff>
--- a/docs/Rename Table.docx
+++ b/docs/Rename Table.docx
@@ -85,16 +85,7 @@
           <w:sz w:val="24"/>
           <w:szCs w:val="24"/>
         </w:rPr>
-        <w:t xml:space="preserve">a) </w:t>
-      </w:r>
-      <w:r>
-        <w:rPr>
-          <w:rFonts w:cs="Times New Roman" w:ascii="Times New Roman" w:hAnsi="Times New Roman"/>
-          <w:b/>
-          <w:sz w:val="24"/>
-          <w:szCs w:val="24"/>
-        </w:rPr>
-        <w:t>Instructions:</w:t>
+        <w:t>a) Instructions:</w:t>
       </w:r>
     </w:p>
     <w:p>
@@ -114,14 +105,6 @@
         </w:rPr>
         <w:tab/>
         <w:t>decode_instr:</w:t>
-      </w:r>
-      <w:r>
-        <w:rPr>
-          <w:rFonts w:cs="Times New Roman" w:ascii="Times New Roman" w:hAnsi="Times New Roman"/>
-          <w:b/>
-          <w:sz w:val="24"/>
-          <w:szCs w:val="24"/>
-        </w:rPr>
         <w:softHyphen/>
       </w:r>
     </w:p>
@@ -275,14 +258,7 @@
           <w:rFonts w:cs="Times New Roman" w:ascii="Times New Roman" w:hAnsi="Times New Roman"/>
           <w:sz w:val="24"/>
         </w:rPr>
-        <w:t>is_</w:t>
-      </w:r>
-      <w:r>
-        <w:rPr>
-          <w:rFonts w:cs="Times New Roman" w:ascii="Times New Roman" w:hAnsi="Times New Roman"/>
-          <w:sz w:val="24"/>
-        </w:rPr>
-        <w:t>imm</w:t>
+        <w:t>is_imm</w:t>
       </w:r>
     </w:p>
     <w:p>
@@ -562,15 +538,7 @@
           <w:sz w:val="24"/>
           <w:szCs w:val="24"/>
         </w:rPr>
-        <w:t>is_</w:t>
-      </w:r>
-      <w:r>
-        <w:rPr>
-          <w:rFonts w:cs="Times New Roman" w:ascii="Times New Roman" w:hAnsi="Times New Roman"/>
-          <w:sz w:val="24"/>
-          <w:szCs w:val="24"/>
-        </w:rPr>
-        <w:t>imm</w:t>
+        <w:t>is_imm</w:t>
       </w:r>
     </w:p>
     <w:p>
@@ -837,15 +805,7 @@
           <w:sz w:val="24"/>
           <w:szCs w:val="24"/>
         </w:rPr>
-        <w:t>is_</w:t>
-      </w:r>
-      <w:r>
-        <w:rPr>
-          <w:rFonts w:cs="Times New Roman" w:ascii="Times New Roman" w:hAnsi="Times New Roman"/>
-          <w:sz w:val="24"/>
-          <w:szCs w:val="24"/>
-        </w:rPr>
-        <w:t>imm  (only for ALU and LSU)</w:t>
+        <w:t>is_imm  (only for ALU and LSU)</w:t>
       </w:r>
     </w:p>
     <w:p>
@@ -1140,15 +1100,7 @@
           <w:sz w:val="24"/>
           <w:szCs w:val="24"/>
         </w:rPr>
-        <w:t>s</w:t>
-      </w:r>
-      <w:r>
-        <w:rPr>
-          <w:rFonts w:cs="Times New Roman" w:ascii="Times New Roman" w:hAnsi="Times New Roman"/>
-          <w:sz w:val="24"/>
-          <w:szCs w:val="24"/>
-        </w:rPr>
-        <w:t>pecTag is the last physical register assigned to a given architectural register</w:t>
+        <w:t>specTag is the last physical register assigned to a given architectural register</w:t>
       </w:r>
     </w:p>
     <w:p>
@@ -1288,15 +1240,7 @@
           <w:sz w:val="24"/>
           <w:szCs w:val="24"/>
         </w:rPr>
-        <w:t xml:space="preserve">p5 is now </w:t>
-      </w:r>
-      <w:r>
-        <w:rPr>
-          <w:rFonts w:cs="Times New Roman" w:ascii="Times New Roman" w:hAnsi="Times New Roman"/>
-          <w:sz w:val="24"/>
-          <w:szCs w:val="24"/>
-        </w:rPr>
-        <w:t>free for assignment as a specTag</w:t>
+        <w:t>p5 is now free for assignment as a specTag</w:t>
       </w:r>
     </w:p>
     <w:p>
@@ -1353,7 +1297,7 @@
       </w:tblPr>
       <w:tblGrid>
         <w:gridCol w:w="1659"/>
-        <w:gridCol w:w="1909"/>
+        <w:gridCol w:w="1908"/>
         <w:gridCol w:w="3371"/>
         <w:gridCol w:w="2410"/>
       </w:tblGrid>
@@ -1392,7 +1336,7 @@
         </w:tc>
         <w:tc>
           <w:tcPr>
-            <w:tcW w:w="1909" w:type="dxa"/>
+            <w:tcW w:w="1908" w:type="dxa"/>
             <w:tcBorders>
               <w:right w:val="nil"/>
             </w:tcBorders>
@@ -1482,17 +1426,7 @@
                 <w:szCs w:val="24"/>
                 <w:lang w:val="en-US" w:eastAsia="en-US" w:bidi="ar-SA"/>
               </w:rPr>
-              <w:t>r</w:t>
-            </w:r>
-            <w:r>
-              <w:rPr>
-                <w:rFonts w:eastAsia="Calibri" w:cs="Times New Roman" w:ascii="Times New Roman" w:hAnsi="Times New Roman"/>
-                <w:kern w:val="0"/>
-                <w:sz w:val="24"/>
-                <w:szCs w:val="24"/>
-                <w:lang w:val="en-US" w:eastAsia="en-US" w:bidi="ar-SA"/>
-              </w:rPr>
-              <w:t>eady</w:t>
+              <w:t>ready</w:t>
             </w:r>
           </w:p>
         </w:tc>
@@ -1618,15 +1552,7 @@
           <w:sz w:val="24"/>
           <w:szCs w:val="24"/>
         </w:rPr>
-        <w:t>r</w:t>
-      </w:r>
-      <w:r>
-        <w:rPr>
-          <w:rFonts w:cs="Times New Roman" w:ascii="Times New Roman" w:hAnsi="Times New Roman"/>
-          <w:sz w:val="24"/>
-          <w:szCs w:val="24"/>
-        </w:rPr>
-        <w:t>eady implies that result in a tag is ready to be read</w:t>
+        <w:t>ready implies that result in a tag is ready to be read</w:t>
       </w:r>
     </w:p>
     <w:p>
@@ -1702,25 +1628,25 @@
         <w:tblLook w:val="04a0" w:noHBand="0" w:noVBand="1" w:firstColumn="1" w:lastRow="0" w:lastColumn="0" w:firstRow="1"/>
       </w:tblPr>
       <w:tblGrid>
-        <w:gridCol w:w="572"/>
-        <w:gridCol w:w="442"/>
-        <w:gridCol w:w="648"/>
-        <w:gridCol w:w="604"/>
+        <w:gridCol w:w="570"/>
+        <w:gridCol w:w="444"/>
+        <w:gridCol w:w="646"/>
+        <w:gridCol w:w="606"/>
         <w:gridCol w:w="832"/>
         <w:gridCol w:w="789"/>
         <w:gridCol w:w="832"/>
         <w:gridCol w:w="789"/>
-        <w:gridCol w:w="756"/>
+        <w:gridCol w:w="755"/>
         <w:gridCol w:w="843"/>
         <w:gridCol w:w="615"/>
-        <w:gridCol w:w="854"/>
-        <w:gridCol w:w="887"/>
+        <w:gridCol w:w="856"/>
+        <w:gridCol w:w="885"/>
       </w:tblGrid>
       <w:tr>
         <w:trPr/>
         <w:tc>
           <w:tcPr>
-            <w:tcW w:w="572" w:type="dxa"/>
+            <w:tcW w:w="570" w:type="dxa"/>
             <w:tcBorders/>
           </w:tcPr>
           <w:p>
@@ -1746,23 +1672,13 @@
                 <w:szCs w:val="18"/>
                 <w:lang w:val="en-US" w:eastAsia="en-US" w:bidi="ar-SA"/>
               </w:rPr>
-              <w:t>s</w:t>
-            </w:r>
-            <w:r>
-              <w:rPr>
-                <w:rFonts w:eastAsia="Calibri" w:cs="Times New Roman" w:ascii="Times New Roman" w:hAnsi="Times New Roman"/>
-                <w:kern w:val="0"/>
-                <w:sz w:val="18"/>
-                <w:szCs w:val="18"/>
-                <w:lang w:val="en-US" w:eastAsia="en-US" w:bidi="ar-SA"/>
-              </w:rPr>
-              <w:t>qN</w:t>
+              <w:t>sqN</w:t>
             </w:r>
           </w:p>
         </w:tc>
         <w:tc>
           <w:tcPr>
-            <w:tcW w:w="442" w:type="dxa"/>
+            <w:tcW w:w="444" w:type="dxa"/>
             <w:tcBorders>
               <w:right w:val="nil"/>
             </w:tcBorders>
@@ -1796,7 +1712,7 @@
         </w:tc>
         <w:tc>
           <w:tcPr>
-            <w:tcW w:w="648" w:type="dxa"/>
+            <w:tcW w:w="646" w:type="dxa"/>
             <w:tcBorders/>
           </w:tcPr>
           <w:p>
@@ -1826,7 +1742,7 @@
         </w:tc>
         <w:tc>
           <w:tcPr>
-            <w:tcW w:w="604" w:type="dxa"/>
+            <w:tcW w:w="606" w:type="dxa"/>
             <w:tcBorders/>
           </w:tcPr>
           <w:p>
@@ -1884,17 +1800,7 @@
                 <w:szCs w:val="18"/>
                 <w:lang w:val="en-US" w:eastAsia="en-US" w:bidi="ar-SA"/>
               </w:rPr>
-              <w:t>r</w:t>
-            </w:r>
-            <w:r>
-              <w:rPr>
-                <w:rFonts w:eastAsia="Calibri" w:cs="Times New Roman" w:ascii="Times New Roman" w:hAnsi="Times New Roman"/>
-                <w:kern w:val="0"/>
-                <w:sz w:val="18"/>
-                <w:szCs w:val="18"/>
-                <w:lang w:val="en-US" w:eastAsia="en-US" w:bidi="ar-SA"/>
-              </w:rPr>
-              <w:t>s1_tag</w:t>
+              <w:t>rs1_tag</w:t>
             </w:r>
           </w:p>
         </w:tc>
@@ -1998,7 +1904,7 @@
         </w:tc>
         <w:tc>
           <w:tcPr>
-            <w:tcW w:w="756" w:type="dxa"/>
+            <w:tcW w:w="755" w:type="dxa"/>
             <w:tcBorders/>
           </w:tcPr>
           <w:p>
@@ -2054,17 +1960,7 @@
                 <w:szCs w:val="18"/>
                 <w:lang w:val="en-US" w:eastAsia="en-US" w:bidi="ar-SA"/>
               </w:rPr>
-              <w:t>is_</w:t>
-            </w:r>
-            <w:r>
-              <w:rPr>
-                <w:rFonts w:eastAsia="Calibri" w:cs="Times New Roman" w:ascii="Times New Roman" w:hAnsi="Times New Roman"/>
-                <w:kern w:val="0"/>
-                <w:sz w:val="18"/>
-                <w:szCs w:val="18"/>
-                <w:lang w:val="en-US" w:eastAsia="en-US" w:bidi="ar-SA"/>
-              </w:rPr>
-              <w:t>imm</w:t>
+              <w:t>is_imm</w:t>
             </w:r>
           </w:p>
         </w:tc>
@@ -2102,7 +1998,7 @@
         </w:tc>
         <w:tc>
           <w:tcPr>
-            <w:tcW w:w="854" w:type="dxa"/>
+            <w:tcW w:w="856" w:type="dxa"/>
             <w:tcBorders/>
           </w:tcPr>
           <w:p>
@@ -2134,7 +2030,7 @@
         </w:tc>
         <w:tc>
           <w:tcPr>
-            <w:tcW w:w="887" w:type="dxa"/>
+            <w:tcW w:w="885" w:type="dxa"/>
             <w:tcBorders/>
           </w:tcPr>
           <w:p>
@@ -2262,63 +2158,7 @@
           <w:sz w:val="24"/>
           <w:szCs w:val="24"/>
         </w:rPr>
-        <w:t xml:space="preserve">Type of possible instruction. Based on the type </w:t>
-      </w:r>
-      <w:r>
-        <w:rPr>
-          <w:rFonts w:cs="Times New Roman" w:ascii="Times New Roman" w:hAnsi="Times New Roman"/>
-          <w:sz w:val="24"/>
-          <w:szCs w:val="24"/>
-        </w:rPr>
-        <w:t>of the instruction,</w:t>
-      </w:r>
-      <w:r>
-        <w:rPr>
-          <w:rFonts w:cs="Times New Roman" w:ascii="Times New Roman" w:hAnsi="Times New Roman"/>
-          <w:sz w:val="24"/>
-          <w:szCs w:val="24"/>
-        </w:rPr>
-        <w:t xml:space="preserve"> decisions for oper 1 and 2 are taken. For instance, if it is a jump type. oper1 = pc and oper2 = 4, so </w:t>
-      </w:r>
-      <w:r>
-        <w:rPr>
-          <w:rFonts w:cs="Times New Roman" w:ascii="Times New Roman" w:hAnsi="Times New Roman"/>
-          <w:sz w:val="24"/>
-          <w:szCs w:val="24"/>
-        </w:rPr>
-        <w:t>ready</w:t>
-      </w:r>
-      <w:r>
-        <w:rPr>
-          <w:rFonts w:cs="Times New Roman" w:ascii="Times New Roman" w:hAnsi="Times New Roman"/>
-          <w:sz w:val="24"/>
-          <w:szCs w:val="24"/>
-        </w:rPr>
-        <w:t xml:space="preserve">1 and </w:t>
-      </w:r>
-      <w:r>
-        <w:rPr>
-          <w:rFonts w:cs="Times New Roman" w:ascii="Times New Roman" w:hAnsi="Times New Roman"/>
-          <w:sz w:val="24"/>
-          <w:szCs w:val="24"/>
-        </w:rPr>
-        <w:t>ready</w:t>
-      </w:r>
-      <w:r>
-        <w:rPr>
-          <w:rFonts w:cs="Times New Roman" w:ascii="Times New Roman" w:hAnsi="Times New Roman"/>
-          <w:sz w:val="24"/>
-          <w:szCs w:val="24"/>
-        </w:rPr>
-        <w:t xml:space="preserve">2 will be </w:t>
-      </w:r>
-      <w:r>
-        <w:rPr>
-          <w:rFonts w:cs="Times New Roman" w:ascii="Times New Roman" w:hAnsi="Times New Roman"/>
-          <w:sz w:val="24"/>
-          <w:szCs w:val="24"/>
-        </w:rPr>
-        <w:t>set automatically</w:t>
+        <w:t>Type of possible instruction. Based on the type of the instruction, decisions for oper 1 and 2 are taken. For instance, if it is a jump type. oper1 = pc and oper2 = 4, so ready1 and ready2 will be set automatically</w:t>
       </w:r>
     </w:p>
     <w:p>
@@ -2360,31 +2200,7 @@
           <w:sz w:val="24"/>
           <w:szCs w:val="24"/>
         </w:rPr>
-        <w:t>r</w:t>
-      </w:r>
-      <w:r>
-        <w:rPr>
-          <w:rFonts w:cs="Times New Roman" w:ascii="Times New Roman" w:hAnsi="Times New Roman"/>
-          <w:sz w:val="24"/>
-          <w:szCs w:val="24"/>
-        </w:rPr>
-        <w:t>eady</w:t>
-      </w:r>
-      <w:r>
-        <w:rPr>
-          <w:rFonts w:cs="Times New Roman" w:ascii="Times New Roman" w:hAnsi="Times New Roman"/>
-          <w:sz w:val="24"/>
-          <w:szCs w:val="24"/>
-        </w:rPr>
-        <w:t>1 and ready2,</w:t>
-      </w:r>
-      <w:r>
-        <w:rPr>
-          <w:rFonts w:cs="Times New Roman" w:ascii="Times New Roman" w:hAnsi="Times New Roman"/>
-          <w:sz w:val="24"/>
-          <w:szCs w:val="24"/>
-        </w:rPr>
-        <w:t xml:space="preserve"> if the corresponding operand is available </w:t>
+        <w:t xml:space="preserve">ready1 and ready2, if the corresponding operand is available </w:t>
       </w:r>
     </w:p>
     <w:p>
@@ -2426,23 +2242,7 @@
           <w:sz w:val="24"/>
           <w:szCs w:val="24"/>
         </w:rPr>
-        <w:t xml:space="preserve">Valid tells if </w:t>
-      </w:r>
-      <w:r>
-        <w:rPr>
-          <w:rFonts w:cs="Times New Roman" w:ascii="Times New Roman" w:hAnsi="Times New Roman"/>
-          <w:sz w:val="24"/>
-          <w:szCs w:val="24"/>
-        </w:rPr>
-        <w:t>entry</w:t>
-      </w:r>
-      <w:r>
-        <w:rPr>
-          <w:rFonts w:cs="Times New Roman" w:ascii="Times New Roman" w:hAnsi="Times New Roman"/>
-          <w:sz w:val="24"/>
-          <w:szCs w:val="24"/>
-        </w:rPr>
-        <w:t xml:space="preserve"> is valid </w:t>
+        <w:t xml:space="preserve">Valid tells if entry is valid </w:t>
       </w:r>
     </w:p>
     <w:p>
@@ -2652,17 +2452,7 @@
                 <w:szCs w:val="24"/>
                 <w:lang w:val="en-US" w:eastAsia="en-US" w:bidi="ar-SA"/>
               </w:rPr>
-              <w:t>s</w:t>
-            </w:r>
-            <w:r>
-              <w:rPr>
-                <w:rFonts w:eastAsia="Calibri" w:cs="Times New Roman" w:ascii="Times New Roman" w:hAnsi="Times New Roman"/>
-                <w:kern w:val="0"/>
-                <w:sz w:val="24"/>
-                <w:szCs w:val="24"/>
-                <w:lang w:val="en-US" w:eastAsia="en-US" w:bidi="ar-SA"/>
-              </w:rPr>
-              <w:t>qN</w:t>
+              <w:t>sqN</w:t>
             </w:r>
           </w:p>
         </w:tc>
@@ -2898,23 +2688,7 @@
           <w:sz w:val="24"/>
           <w:szCs w:val="24"/>
         </w:rPr>
-        <w:t>Architectural Destination Register (</w:t>
-      </w:r>
-      <w:r>
-        <w:rPr>
-          <w:rFonts w:cs="Times New Roman" w:ascii="Times New Roman" w:hAnsi="Times New Roman"/>
-          <w:sz w:val="24"/>
-          <w:szCs w:val="24"/>
-        </w:rPr>
-        <w:t>arch_tag</w:t>
-      </w:r>
-      <w:r>
-        <w:rPr>
-          <w:rFonts w:cs="Times New Roman" w:ascii="Times New Roman" w:hAnsi="Times New Roman"/>
-          <w:sz w:val="24"/>
-          <w:szCs w:val="24"/>
-        </w:rPr>
-        <w:t>)</w:t>
+        <w:t>Architectural Destination Register (arch_tag)</w:t>
       </w:r>
     </w:p>
     <w:p>
@@ -2956,31 +2730,7 @@
           <w:sz w:val="24"/>
           <w:szCs w:val="24"/>
         </w:rPr>
-        <w:t>p</w:t>
-      </w:r>
-      <w:r>
-        <w:rPr>
-          <w:rFonts w:cs="Times New Roman" w:ascii="Times New Roman" w:hAnsi="Times New Roman"/>
-          <w:sz w:val="24"/>
-          <w:szCs w:val="24"/>
-        </w:rPr>
-        <w:t xml:space="preserve">c of that instruction, which can be used to restore program order in case of a flush </w:t>
-      </w:r>
-      <w:r>
-        <w:rPr>
-          <w:rFonts w:cs="Times New Roman" w:ascii="Times New Roman" w:hAnsi="Times New Roman"/>
-          <w:sz w:val="24"/>
-          <w:szCs w:val="24"/>
-        </w:rPr>
-        <w:t>a</w:t>
-      </w:r>
-      <w:r>
-        <w:rPr>
-          <w:rFonts w:cs="Times New Roman" w:ascii="Times New Roman" w:hAnsi="Times New Roman"/>
-          <w:sz w:val="24"/>
-          <w:szCs w:val="24"/>
-        </w:rPr>
-        <w:t>re stored</w:t>
+        <w:t>pc of that instruction, which can be used to restore program order in case of a flush are stored</w:t>
       </w:r>
     </w:p>
     <w:p>
@@ -3022,23 +2772,7 @@
           <w:sz w:val="24"/>
           <w:szCs w:val="24"/>
         </w:rPr>
-        <w:t xml:space="preserve">valid bit signifies if </w:t>
-      </w:r>
-      <w:r>
-        <w:rPr>
-          <w:rFonts w:cs="Times New Roman" w:ascii="Times New Roman" w:hAnsi="Times New Roman"/>
-          <w:sz w:val="24"/>
-          <w:szCs w:val="24"/>
-        </w:rPr>
-        <w:t>entry</w:t>
-      </w:r>
-      <w:r>
-        <w:rPr>
-          <w:rFonts w:cs="Times New Roman" w:ascii="Times New Roman" w:hAnsi="Times New Roman"/>
-          <w:sz w:val="24"/>
-          <w:szCs w:val="24"/>
-        </w:rPr>
-        <w:t xml:space="preserve"> is valid </w:t>
+        <w:t xml:space="preserve">valid bit signifies if entry is valid </w:t>
       </w:r>
     </w:p>
     <w:p>
@@ -3311,8 +3045,7 @@
       </w:pPr>
       <w:r>
         <w:rPr>
-          <w:sz w:val="24"/>
-          <w:szCs w:val="24"/>
+          <w:rFonts w:cs="Times New Roman" w:ascii="Times New Roman" w:hAnsi="Times New Roman"/>
         </w:rPr>
       </w:r>
     </w:p>
@@ -3386,6 +3119,7 @@
           <w:szCs w:val="24"/>
         </w:rPr>
         <w:t>It checks if the pc is 4 or 8 bit aligned</w:t>
+        <w:softHyphen/>
       </w:r>
     </w:p>
     <w:p>
@@ -3517,56 +3251,6 @@
       <w:pPr>
         <w:pStyle w:val="ListParagraph"/>
         <w:numPr>
-          <w:ilvl w:val="0"/>
-          <w:numId w:val="13"/>
-        </w:numPr>
-        <w:rPr>
-          <w:b w:val="false"/>
-          <w:bCs w:val="false"/>
-          <w:sz w:val="24"/>
-          <w:szCs w:val="24"/>
-        </w:rPr>
-      </w:pPr>
-      <w:r>
-        <w:rPr>
-          <w:rFonts w:cs="Times New Roman" w:ascii="Times New Roman" w:hAnsi="Times New Roman"/>
-          <w:b w:val="false"/>
-          <w:bCs w:val="false"/>
-          <w:sz w:val="24"/>
-          <w:szCs w:val="24"/>
-        </w:rPr>
-        <w:t>Fetch buffer forwards at most two instructions from its head to decode</w:t>
-      </w:r>
-    </w:p>
-    <w:p>
-      <w:pPr>
-        <w:pStyle w:val="ListParagraph"/>
-        <w:numPr>
-          <w:ilvl w:val="0"/>
-          <w:numId w:val="13"/>
-        </w:numPr>
-        <w:rPr>
-          <w:b w:val="false"/>
-          <w:bCs w:val="false"/>
-          <w:sz w:val="24"/>
-          <w:szCs w:val="24"/>
-        </w:rPr>
-      </w:pPr>
-      <w:r>
-        <w:rPr>
-          <w:rFonts w:cs="Times New Roman" w:ascii="Times New Roman" w:hAnsi="Times New Roman"/>
-          <w:b w:val="false"/>
-          <w:bCs w:val="false"/>
-          <w:sz w:val="24"/>
-          <w:szCs w:val="24"/>
-        </w:rPr>
-        <w:t>In decode</w:t>
-      </w:r>
-    </w:p>
-    <w:p>
-      <w:pPr>
-        <w:pStyle w:val="ListParagraph"/>
-        <w:numPr>
           <w:ilvl w:val="1"/>
           <w:numId w:val="13"/>
         </w:numPr>
@@ -3585,7 +3269,7 @@
           <w:sz w:val="24"/>
           <w:szCs w:val="24"/>
         </w:rPr>
-        <w:t>If instruction is branch or jumpy type, the simple predictor always generates a jump signal</w:t>
+        <w:t>The instruction aligner also forwards the pc of instructions, their valid bits, opcodes and immediate field (based on JAL) to JTA1 (jump target address calculator)</w:t>
       </w:r>
     </w:p>
     <w:p>
@@ -3610,7 +3294,7 @@
           <w:sz w:val="24"/>
           <w:szCs w:val="24"/>
         </w:rPr>
-        <w:t>Based on the pc and immediate of that instruction, a target address is calculated for the jump</w:t>
+        <w:t xml:space="preserve">If opcode of any instr matches with 111, it is a JAL instruction, on which JTA1 calculates the jump address, and sends jump1 signal </w:t>
       </w:r>
     </w:p>
     <w:p>
@@ -3621,21 +3305,32 @@
           <w:numId w:val="13"/>
         </w:numPr>
         <w:rPr>
-          <w:b w:val="false"/>
-          <w:bCs w:val="false"/>
-          <w:sz w:val="24"/>
-          <w:szCs w:val="24"/>
-        </w:rPr>
-      </w:pPr>
-      <w:r>
-        <w:rPr>
-          <w:rFonts w:cs="Times New Roman" w:ascii="Times New Roman" w:hAnsi="Times New Roman"/>
-          <w:b w:val="false"/>
-          <w:bCs w:val="false"/>
-          <w:sz w:val="24"/>
-          <w:szCs w:val="24"/>
-        </w:rPr>
-        <w:t>In case, if both instructions are jump/branch, the first one is given priority</w:t>
+          <w:rFonts w:ascii="Times New Roman" w:hAnsi="Times New Roman"/>
+          <w:b/>
+          <w:bCs/>
+          <w:sz w:val="24"/>
+          <w:szCs w:val="24"/>
+        </w:rPr>
+      </w:pPr>
+      <w:r>
+        <w:rPr>
+          <w:rFonts w:ascii="Times New Roman" w:hAnsi="Times New Roman"/>
+          <w:b/>
+          <w:bCs/>
+          <w:sz w:val="24"/>
+          <w:szCs w:val="24"/>
+        </w:rPr>
+        <w:t xml:space="preserve">Special case: </w:t>
+      </w:r>
+      <w:r>
+        <w:rPr>
+          <w:rFonts w:ascii="Times New Roman" w:hAnsi="Times New Roman"/>
+          <w:b w:val="false"/>
+          <w:bCs w:val="false"/>
+          <w:sz w:val="24"/>
+          <w:szCs w:val="24"/>
+        </w:rPr>
+        <w:t>If both instructions sent to JTA1 are JAL, then older one is given priority</w:t>
       </w:r>
     </w:p>
     <w:p>
@@ -3660,7 +3355,7 @@
           <w:sz w:val="24"/>
           <w:szCs w:val="24"/>
         </w:rPr>
-        <w:t>This target address and jump signal, are forwarded to pc, bypassing pipeline register</w:t>
+        <w:t>A delayed version of jump1 is also sent to instruction aligner to invalidate the wrongly loaded instructions</w:t>
       </w:r>
     </w:p>
     <w:p>
@@ -3671,71 +3366,18 @@
           <w:numId w:val="13"/>
         </w:numPr>
         <w:rPr>
-          <w:b w:val="false"/>
-          <w:bCs w:val="false"/>
-          <w:sz w:val="24"/>
-          <w:szCs w:val="24"/>
-        </w:rPr>
-      </w:pPr>
-      <w:r>
-        <w:rPr>
-          <w:rFonts w:cs="Times New Roman" w:ascii="Times New Roman" w:hAnsi="Times New Roman"/>
-          <w:b w:val="false"/>
-          <w:bCs w:val="false"/>
-          <w:sz w:val="24"/>
-          <w:szCs w:val="24"/>
-        </w:rPr>
-        <w:t xml:space="preserve">jump signal also acts as flush for fetch buffer, clearing any pre-loaded instructions </w:t>
-      </w:r>
-    </w:p>
-    <w:p>
-      <w:pPr>
-        <w:pStyle w:val="ListParagraph"/>
-        <w:numPr>
-          <w:ilvl w:val="0"/>
-          <w:numId w:val="13"/>
-        </w:numPr>
-        <w:rPr>
-          <w:b w:val="false"/>
-          <w:bCs w:val="false"/>
-          <w:sz w:val="24"/>
-          <w:szCs w:val="24"/>
-        </w:rPr>
-      </w:pPr>
-      <w:r>
-        <w:rPr>
-          <w:rFonts w:cs="Times New Roman" w:ascii="Times New Roman" w:hAnsi="Times New Roman"/>
-          <w:b w:val="false"/>
-          <w:bCs w:val="false"/>
-          <w:sz w:val="24"/>
-          <w:szCs w:val="24"/>
-        </w:rPr>
-        <w:t>Decode stage register forwards at most two instructions to rename table</w:t>
-      </w:r>
-    </w:p>
-    <w:p>
-      <w:pPr>
-        <w:pStyle w:val="ListParagraph"/>
-        <w:numPr>
-          <w:ilvl w:val="0"/>
-          <w:numId w:val="13"/>
-        </w:numPr>
-        <w:rPr>
-          <w:b w:val="false"/>
-          <w:bCs w:val="false"/>
-          <w:sz w:val="24"/>
-          <w:szCs w:val="24"/>
-        </w:rPr>
-      </w:pPr>
-      <w:r>
-        <w:rPr>
-          <w:rFonts w:cs="Times New Roman" w:ascii="Times New Roman" w:hAnsi="Times New Roman"/>
-          <w:b w:val="false"/>
-          <w:bCs w:val="false"/>
-          <w:sz w:val="24"/>
-          <w:szCs w:val="24"/>
-        </w:rPr>
-        <w:t>In rename table</w:t>
+          <w:rFonts w:ascii="Times New Roman" w:hAnsi="Times New Roman"/>
+          <w:b/>
+          <w:bCs/>
+        </w:rPr>
+      </w:pPr>
+      <w:r>
+        <w:rPr>
+          <w:rFonts w:ascii="Times New Roman" w:hAnsi="Times New Roman"/>
+          <w:b/>
+          <w:bCs/>
+        </w:rPr>
+        <w:t>JTA1 is fully combinational, so its output is available before the next clock cycle</w:t>
       </w:r>
     </w:p>
     <w:p>
@@ -3746,21 +3388,118 @@
           <w:numId w:val="13"/>
         </w:numPr>
         <w:rPr>
-          <w:b w:val="false"/>
-          <w:bCs w:val="false"/>
-          <w:sz w:val="24"/>
-          <w:szCs w:val="24"/>
-        </w:rPr>
-      </w:pPr>
-      <w:r>
-        <w:rPr>
-          <w:rFonts w:cs="Times New Roman" w:ascii="Times New Roman" w:hAnsi="Times New Roman"/>
-          <w:b w:val="false"/>
-          <w:bCs w:val="false"/>
-          <w:sz w:val="24"/>
-          <w:szCs w:val="24"/>
-        </w:rPr>
-        <w:t>For the two instructions received, their rs (read) registers are checked against the archReg, in rename table → Corresponding specTags become rs_tags for that instruction</w:t>
+          <w:rFonts w:ascii="Times New Roman" w:hAnsi="Times New Roman"/>
+          <w:b w:val="false"/>
+          <w:bCs w:val="false"/>
+        </w:rPr>
+      </w:pPr>
+      <w:r>
+        <w:rPr>
+          <w:rFonts w:ascii="Times New Roman" w:hAnsi="Times New Roman"/>
+          <w:b w:val="false"/>
+          <w:bCs w:val="false"/>
+        </w:rPr>
+        <w:t>Branch and jalr are assumed not taken</w:t>
+      </w:r>
+    </w:p>
+    <w:p>
+      <w:pPr>
+        <w:pStyle w:val="ListParagraph"/>
+        <w:numPr>
+          <w:ilvl w:val="0"/>
+          <w:numId w:val="13"/>
+        </w:numPr>
+        <w:rPr>
+          <w:b w:val="false"/>
+          <w:bCs w:val="false"/>
+          <w:sz w:val="24"/>
+          <w:szCs w:val="24"/>
+        </w:rPr>
+      </w:pPr>
+      <w:r>
+        <w:rPr>
+          <w:rFonts w:cs="Times New Roman" w:ascii="Times New Roman" w:hAnsi="Times New Roman"/>
+          <w:b w:val="false"/>
+          <w:bCs w:val="false"/>
+          <w:sz w:val="24"/>
+          <w:szCs w:val="24"/>
+        </w:rPr>
+        <w:t>Fetch buffer forwards at most two instructions from its head to decode</w:t>
+      </w:r>
+    </w:p>
+    <w:p>
+      <w:pPr>
+        <w:pStyle w:val="ListParagraph"/>
+        <w:numPr>
+          <w:ilvl w:val="0"/>
+          <w:numId w:val="13"/>
+        </w:numPr>
+        <w:rPr>
+          <w:b w:val="false"/>
+          <w:bCs w:val="false"/>
+          <w:sz w:val="24"/>
+          <w:szCs w:val="24"/>
+        </w:rPr>
+      </w:pPr>
+      <w:r>
+        <w:rPr>
+          <w:rFonts w:cs="Times New Roman" w:ascii="Times New Roman" w:hAnsi="Times New Roman"/>
+          <w:b w:val="false"/>
+          <w:bCs w:val="false"/>
+          <w:sz w:val="24"/>
+          <w:szCs w:val="24"/>
+        </w:rPr>
+        <w:t>Instructions after decoding are passed from decode stage register to rename table</w:t>
+      </w:r>
+    </w:p>
+    <w:p>
+      <w:pPr>
+        <w:pStyle w:val="ListParagraph"/>
+        <w:numPr>
+          <w:ilvl w:val="0"/>
+          <w:numId w:val="13"/>
+        </w:numPr>
+        <w:rPr>
+          <w:b w:val="false"/>
+          <w:bCs w:val="false"/>
+          <w:sz w:val="24"/>
+          <w:szCs w:val="24"/>
+        </w:rPr>
+      </w:pPr>
+      <w:r>
+        <w:rPr>
+          <w:rFonts w:cs="Times New Roman" w:ascii="Times New Roman" w:hAnsi="Times New Roman"/>
+          <w:b w:val="false"/>
+          <w:bCs w:val="false"/>
+          <w:sz w:val="24"/>
+          <w:szCs w:val="24"/>
+        </w:rPr>
+        <w:t>Decode stage register forwards at most two instructions to rename table</w:t>
+      </w:r>
+    </w:p>
+    <w:p>
+      <w:pPr>
+        <w:pStyle w:val="ListParagraph"/>
+        <w:numPr>
+          <w:ilvl w:val="0"/>
+          <w:numId w:val="13"/>
+        </w:numPr>
+        <w:rPr>
+          <w:b w:val="false"/>
+          <w:bCs w:val="false"/>
+          <w:sz w:val="24"/>
+          <w:szCs w:val="24"/>
+        </w:rPr>
+      </w:pPr>
+      <w:r>
+        <w:rPr>
+          <w:rFonts w:cs="Times New Roman" w:ascii="Times New Roman" w:hAnsi="Times New Roman"/>
+          <w:b w:val="false"/>
+          <w:bCs w:val="false"/>
+          <w:sz w:val="24"/>
+          <w:szCs w:val="24"/>
+        </w:rPr>
+        <w:t>In rename table</w:t>
       </w:r>
     </w:p>
     <w:p>
@@ -3785,7 +3524,7 @@
           <w:sz w:val="24"/>
           <w:szCs w:val="24"/>
         </w:rPr>
-        <w:t>Tag buffer sends two free tags to rename table, which assigns those tags to the rd registers as rd_tags. Correspondingly, those tags are stored as specTags for that rd (archReg)</w:t>
+        <w:t>For the two instructions received, their rs (read) registers are checked against the archReg, in rename table → Corresponding specTags become rs_tags for that instruction</w:t>
       </w:r>
     </w:p>
     <w:p>
@@ -3810,7 +3549,7 @@
           <w:sz w:val="24"/>
           <w:szCs w:val="24"/>
         </w:rPr>
-        <w:t>When a tag is set as specTag in rename table, its free is marked 0 in the tag buffer</w:t>
+        <w:t>Tag buffer sends two free tags to rename table, which assigns those tags to the rd registers as rd_tags. Correspondingly, those tags are stored as specTags for that rd (archReg)</w:t>
       </w:r>
     </w:p>
     <w:p>
@@ -3835,7 +3574,7 @@
           <w:sz w:val="24"/>
           <w:szCs w:val="24"/>
         </w:rPr>
-        <w:t>The renamed instructions are forwarded to dispatch unit</w:t>
+        <w:t>When a tag is set as specTag in rename table, its free is marked 0 in the tag buffer</w:t>
       </w:r>
     </w:p>
     <w:p>
@@ -3860,7 +3599,7 @@
           <w:sz w:val="24"/>
           <w:szCs w:val="24"/>
         </w:rPr>
-        <w:t>For each valid instruction, we forward its sqN, pc, rd (arch_reg) and rd_tag to ROB, so it is stored there in program order</w:t>
+        <w:t>The renamed instructions are forwarded to dispatch unit</w:t>
       </w:r>
     </w:p>
     <w:p>
@@ -3885,7 +3624,7 @@
           <w:sz w:val="24"/>
           <w:szCs w:val="24"/>
         </w:rPr>
-        <w:t>If the renamed instruction is a branch type, in that case, a snapshot of rename table and tag buffer is forwarded and stored in a branch checkpoint unit, along with that instructions sqN</w:t>
+        <w:t>For each valid instruction, its sqN, pc, rd (arch_reg) and rd_tag are forwarded to ROB, so it is stored there in program order</w:t>
       </w:r>
     </w:p>
     <w:p>
@@ -3910,7 +3649,7 @@
           <w:sz w:val="24"/>
           <w:szCs w:val="24"/>
         </w:rPr>
-        <w:t>At anytime, there can be no more than 8 branch instructions in the proceeding pipeline</w:t>
+        <w:t>On commit, comTag and archTags of committed instructions are passed from ROB, to rename table. This new archTag to comTag mapping is saved in the rename table, while the previous comTag, for the corresponding archTag is to be freed</w:t>
       </w:r>
     </w:p>
     <w:p>
@@ -3935,6 +3674,181 @@
           <w:sz w:val="24"/>
           <w:szCs w:val="24"/>
         </w:rPr>
+        <w:t>To do this, the older comTag’s free and feeCom are set to 1 in tag buffer, and the new comTag’s freeCom is marked 0</w:t>
+      </w:r>
+    </w:p>
+    <w:p>
+      <w:pPr>
+        <w:pStyle w:val="ListParagraph"/>
+        <w:numPr>
+          <w:ilvl w:val="1"/>
+          <w:numId w:val="13"/>
+        </w:numPr>
+        <w:rPr>
+          <w:b w:val="false"/>
+          <w:bCs w:val="false"/>
+          <w:sz w:val="24"/>
+          <w:szCs w:val="24"/>
+        </w:rPr>
+      </w:pPr>
+      <w:r>
+        <w:rPr>
+          <w:rFonts w:cs="Times New Roman" w:ascii="Times New Roman" w:hAnsi="Times New Roman"/>
+          <w:b w:val="false"/>
+          <w:bCs w:val="false"/>
+          <w:sz w:val="24"/>
+          <w:szCs w:val="24"/>
+        </w:rPr>
+        <w:t>Tag buffer also keeps track of results in register file. Whether a particular tag result is ready or not</w:t>
+      </w:r>
+    </w:p>
+    <w:p>
+      <w:pPr>
+        <w:pStyle w:val="ListParagraph"/>
+        <w:numPr>
+          <w:ilvl w:val="1"/>
+          <w:numId w:val="13"/>
+        </w:numPr>
+        <w:rPr>
+          <w:b w:val="false"/>
+          <w:bCs w:val="false"/>
+          <w:sz w:val="24"/>
+          <w:szCs w:val="24"/>
+        </w:rPr>
+      </w:pPr>
+      <w:r>
+        <w:rPr>
+          <w:rFonts w:cs="Times New Roman" w:ascii="Times New Roman" w:hAnsi="Times New Roman"/>
+          <w:b w:val="false"/>
+          <w:bCs w:val="false"/>
+          <w:sz w:val="24"/>
+          <w:szCs w:val="24"/>
+        </w:rPr>
+        <w:t>When a free tag is assigned as a specTag, it is marked not ready (since that instruction will write to it, so proceeding instructions need new result)</w:t>
+      </w:r>
+    </w:p>
+    <w:p>
+      <w:pPr>
+        <w:pStyle w:val="ListParagraph"/>
+        <w:numPr>
+          <w:ilvl w:val="1"/>
+          <w:numId w:val="13"/>
+        </w:numPr>
+        <w:rPr>
+          <w:b w:val="false"/>
+          <w:bCs w:val="false"/>
+          <w:sz w:val="24"/>
+          <w:szCs w:val="24"/>
+        </w:rPr>
+      </w:pPr>
+      <w:r>
+        <w:rPr>
+          <w:rFonts w:cs="Times New Roman" w:ascii="Times New Roman" w:hAnsi="Times New Roman"/>
+          <w:b w:val="false"/>
+          <w:bCs w:val="false"/>
+          <w:sz w:val="24"/>
+          <w:szCs w:val="24"/>
+        </w:rPr>
+        <w:t>When a result is broadcasted on CDB, and its tag matches with any on the tag buffer, it is marked ready</w:t>
+      </w:r>
+    </w:p>
+    <w:p>
+      <w:pPr>
+        <w:pStyle w:val="ListParagraph"/>
+        <w:numPr>
+          <w:ilvl w:val="1"/>
+          <w:numId w:val="13"/>
+        </w:numPr>
+        <w:rPr>
+          <w:b w:val="false"/>
+          <w:bCs w:val="false"/>
+          <w:sz w:val="24"/>
+          <w:szCs w:val="24"/>
+        </w:rPr>
+      </w:pPr>
+      <w:r>
+        <w:rPr>
+          <w:rFonts w:cs="Times New Roman" w:ascii="Times New Roman" w:hAnsi="Times New Roman"/>
+          <w:b w:val="false"/>
+          <w:bCs w:val="false"/>
+          <w:sz w:val="24"/>
+          <w:szCs w:val="24"/>
+        </w:rPr>
+        <w:t xml:space="preserve">This ready signal is used by issue buffer to mark operands as ready for issuance </w:t>
+      </w:r>
+    </w:p>
+    <w:p>
+      <w:pPr>
+        <w:pStyle w:val="ListParagraph"/>
+        <w:numPr>
+          <w:ilvl w:val="1"/>
+          <w:numId w:val="13"/>
+        </w:numPr>
+        <w:rPr>
+          <w:b w:val="false"/>
+          <w:bCs w:val="false"/>
+          <w:sz w:val="24"/>
+          <w:szCs w:val="24"/>
+        </w:rPr>
+      </w:pPr>
+      <w:r>
+        <w:rPr>
+          <w:rFonts w:cs="Times New Roman" w:ascii="Times New Roman" w:hAnsi="Times New Roman"/>
+          <w:b w:val="false"/>
+          <w:bCs w:val="false"/>
+          <w:sz w:val="24"/>
+          <w:szCs w:val="24"/>
+        </w:rPr>
+        <w:t>If the renamed instruction is a branch type, in that case, a snapshot of rename table and tag buffer is forwarded and stored in a branch checkpoint unit, along with that instructions sqN</w:t>
+      </w:r>
+    </w:p>
+    <w:p>
+      <w:pPr>
+        <w:pStyle w:val="ListParagraph"/>
+        <w:numPr>
+          <w:ilvl w:val="1"/>
+          <w:numId w:val="13"/>
+        </w:numPr>
+        <w:rPr>
+          <w:b w:val="false"/>
+          <w:bCs w:val="false"/>
+          <w:sz w:val="24"/>
+          <w:szCs w:val="24"/>
+        </w:rPr>
+      </w:pPr>
+      <w:r>
+        <w:rPr>
+          <w:rFonts w:cs="Times New Roman" w:ascii="Times New Roman" w:hAnsi="Times New Roman"/>
+          <w:b w:val="false"/>
+          <w:bCs w:val="false"/>
+          <w:sz w:val="24"/>
+          <w:szCs w:val="24"/>
+        </w:rPr>
+        <w:t>At anytime, there can be no more than 8 branch instructions in the proceeding pipeline</w:t>
+      </w:r>
+    </w:p>
+    <w:p>
+      <w:pPr>
+        <w:pStyle w:val="ListParagraph"/>
+        <w:numPr>
+          <w:ilvl w:val="1"/>
+          <w:numId w:val="13"/>
+        </w:numPr>
+        <w:rPr>
+          <w:b w:val="false"/>
+          <w:bCs w:val="false"/>
+          <w:sz w:val="24"/>
+          <w:szCs w:val="24"/>
+        </w:rPr>
+      </w:pPr>
+      <w:r>
+        <w:rPr>
+          <w:rFonts w:cs="Times New Roman" w:ascii="Times New Roman" w:hAnsi="Times New Roman"/>
+          <w:b w:val="false"/>
+          <w:bCs w:val="false"/>
+          <w:sz w:val="24"/>
+          <w:szCs w:val="24"/>
+        </w:rPr>
         <w:t>If a 9</w:t>
       </w:r>
       <w:r>
@@ -3957,6 +3871,577 @@
           <w:szCs w:val="24"/>
         </w:rPr>
         <w:t xml:space="preserve"> branch instruction comes to rename table, then the preceding pipeline is to be stalled</w:t>
+      </w:r>
+    </w:p>
+    <w:p>
+      <w:pPr>
+        <w:pStyle w:val="ListParagraph"/>
+        <w:numPr>
+          <w:ilvl w:val="0"/>
+          <w:numId w:val="13"/>
+        </w:numPr>
+        <w:rPr>
+          <w:b w:val="false"/>
+          <w:bCs w:val="false"/>
+          <w:sz w:val="24"/>
+          <w:szCs w:val="24"/>
+        </w:rPr>
+      </w:pPr>
+      <w:r>
+        <w:rPr>
+          <w:rFonts w:cs="Times New Roman" w:ascii="Times New Roman" w:hAnsi="Times New Roman"/>
+          <w:b w:val="false"/>
+          <w:bCs w:val="false"/>
+          <w:sz w:val="24"/>
+          <w:szCs w:val="24"/>
+        </w:rPr>
+        <w:t xml:space="preserve">Dispatch unit </w:t>
+      </w:r>
+    </w:p>
+    <w:p>
+      <w:pPr>
+        <w:pStyle w:val="ListParagraph"/>
+        <w:numPr>
+          <w:ilvl w:val="1"/>
+          <w:numId w:val="13"/>
+        </w:numPr>
+        <w:rPr>
+          <w:b w:val="false"/>
+          <w:bCs w:val="false"/>
+          <w:sz w:val="24"/>
+          <w:szCs w:val="24"/>
+        </w:rPr>
+      </w:pPr>
+      <w:r>
+        <w:rPr>
+          <w:rFonts w:cs="Times New Roman" w:ascii="Times New Roman" w:hAnsi="Times New Roman"/>
+          <w:b w:val="false"/>
+          <w:bCs w:val="false"/>
+          <w:sz w:val="24"/>
+          <w:szCs w:val="24"/>
+        </w:rPr>
+        <w:t>Has 3 FIFOs, 1 for ALU, 1 for MUL/DIV, and 1 for Load/Store instructions</w:t>
+      </w:r>
+    </w:p>
+    <w:p>
+      <w:pPr>
+        <w:pStyle w:val="ListParagraph"/>
+        <w:numPr>
+          <w:ilvl w:val="1"/>
+          <w:numId w:val="13"/>
+        </w:numPr>
+        <w:rPr>
+          <w:b w:val="false"/>
+          <w:bCs w:val="false"/>
+          <w:sz w:val="24"/>
+          <w:szCs w:val="24"/>
+        </w:rPr>
+      </w:pPr>
+      <w:r>
+        <w:rPr>
+          <w:rFonts w:cs="Times New Roman" w:ascii="Times New Roman" w:hAnsi="Times New Roman"/>
+          <w:b w:val="false"/>
+          <w:bCs w:val="false"/>
+          <w:sz w:val="24"/>
+          <w:szCs w:val="24"/>
+        </w:rPr>
+        <w:t>The each FIFO sends instruction to its respective issue buffer, if its not full</w:t>
+      </w:r>
+    </w:p>
+    <w:p>
+      <w:pPr>
+        <w:pStyle w:val="ListParagraph"/>
+        <w:numPr>
+          <w:ilvl w:val="1"/>
+          <w:numId w:val="13"/>
+        </w:numPr>
+        <w:rPr>
+          <w:b w:val="false"/>
+          <w:bCs w:val="false"/>
+          <w:sz w:val="24"/>
+          <w:szCs w:val="24"/>
+        </w:rPr>
+      </w:pPr>
+      <w:r>
+        <w:rPr>
+          <w:rFonts w:cs="Times New Roman" w:ascii="Times New Roman" w:hAnsi="Times New Roman"/>
+          <w:b w:val="false"/>
+          <w:bCs w:val="false"/>
+          <w:sz w:val="24"/>
+          <w:szCs w:val="24"/>
+        </w:rPr>
+        <w:t>Dispatch keeps track of this by receiving an is_full signal from the issue buffers</w:t>
+      </w:r>
+    </w:p>
+    <w:p>
+      <w:pPr>
+        <w:pStyle w:val="ListParagraph"/>
+        <w:numPr>
+          <w:ilvl w:val="1"/>
+          <w:numId w:val="13"/>
+        </w:numPr>
+        <w:rPr>
+          <w:b w:val="false"/>
+          <w:bCs w:val="false"/>
+          <w:sz w:val="24"/>
+          <w:szCs w:val="24"/>
+        </w:rPr>
+      </w:pPr>
+      <w:r>
+        <w:rPr>
+          <w:rFonts w:cs="Times New Roman" w:ascii="Times New Roman" w:hAnsi="Times New Roman"/>
+          <w:b w:val="false"/>
+          <w:bCs w:val="false"/>
+          <w:sz w:val="24"/>
+          <w:szCs w:val="24"/>
+        </w:rPr>
+        <w:t>The ALU FIFO can dispatch 2 instructions, one to each ALU buffer</w:t>
+      </w:r>
+    </w:p>
+    <w:p>
+      <w:pPr>
+        <w:pStyle w:val="ListParagraph"/>
+        <w:numPr>
+          <w:ilvl w:val="1"/>
+          <w:numId w:val="13"/>
+        </w:numPr>
+        <w:rPr>
+          <w:b w:val="false"/>
+          <w:bCs w:val="false"/>
+          <w:sz w:val="24"/>
+          <w:szCs w:val="24"/>
+        </w:rPr>
+      </w:pPr>
+      <w:r>
+        <w:rPr>
+          <w:rFonts w:cs="Times New Roman" w:ascii="Times New Roman" w:hAnsi="Times New Roman"/>
+          <w:b w:val="false"/>
+          <w:bCs w:val="false"/>
+          <w:sz w:val="24"/>
+          <w:szCs w:val="24"/>
+        </w:rPr>
+        <w:t>If it contains 1 ALU instruction for consecutive cycles, then it alternates between ALU1 and 2 issue buffers</w:t>
+      </w:r>
+    </w:p>
+    <w:p>
+      <w:pPr>
+        <w:pStyle w:val="ListParagraph"/>
+        <w:numPr>
+          <w:ilvl w:val="0"/>
+          <w:numId w:val="13"/>
+        </w:numPr>
+        <w:rPr>
+          <w:b w:val="false"/>
+          <w:bCs w:val="false"/>
+          <w:sz w:val="24"/>
+          <w:szCs w:val="24"/>
+        </w:rPr>
+      </w:pPr>
+      <w:r>
+        <w:rPr>
+          <w:rFonts w:cs="Times New Roman" w:ascii="Times New Roman" w:hAnsi="Times New Roman"/>
+          <w:b w:val="false"/>
+          <w:bCs w:val="false"/>
+          <w:sz w:val="24"/>
+          <w:szCs w:val="24"/>
+        </w:rPr>
+        <w:t>In issue stage</w:t>
+      </w:r>
+    </w:p>
+    <w:p>
+      <w:pPr>
+        <w:pStyle w:val="ListParagraph"/>
+        <w:numPr>
+          <w:ilvl w:val="1"/>
+          <w:numId w:val="13"/>
+        </w:numPr>
+        <w:rPr>
+          <w:b w:val="false"/>
+          <w:bCs w:val="false"/>
+          <w:sz w:val="24"/>
+          <w:szCs w:val="24"/>
+        </w:rPr>
+      </w:pPr>
+      <w:r>
+        <w:rPr>
+          <w:rFonts w:cs="Times New Roman" w:ascii="Times New Roman" w:hAnsi="Times New Roman"/>
+          <w:b w:val="false"/>
+          <w:bCs w:val="false"/>
+          <w:sz w:val="24"/>
+          <w:szCs w:val="24"/>
+        </w:rPr>
+        <w:t>when an instruction arrives to a buffer, the buffer checks the rs_tags of that instruction from the tag buffer, to see whether they are ready or not</w:t>
+      </w:r>
+    </w:p>
+    <w:p>
+      <w:pPr>
+        <w:pStyle w:val="ListParagraph"/>
+        <w:numPr>
+          <w:ilvl w:val="1"/>
+          <w:numId w:val="13"/>
+        </w:numPr>
+        <w:rPr>
+          <w:b w:val="false"/>
+          <w:bCs w:val="false"/>
+          <w:sz w:val="24"/>
+          <w:szCs w:val="24"/>
+        </w:rPr>
+      </w:pPr>
+      <w:r>
+        <w:rPr>
+          <w:rFonts w:cs="Times New Roman" w:ascii="Times New Roman" w:hAnsi="Times New Roman"/>
+          <w:b w:val="false"/>
+          <w:bCs w:val="false"/>
+          <w:sz w:val="24"/>
+          <w:szCs w:val="24"/>
+        </w:rPr>
+        <w:t xml:space="preserve">If ready, the corresponding operands are marked ready </w:t>
+      </w:r>
+    </w:p>
+    <w:p>
+      <w:pPr>
+        <w:pStyle w:val="ListParagraph"/>
+        <w:numPr>
+          <w:ilvl w:val="1"/>
+          <w:numId w:val="13"/>
+        </w:numPr>
+        <w:rPr>
+          <w:b w:val="false"/>
+          <w:bCs w:val="false"/>
+          <w:sz w:val="24"/>
+          <w:szCs w:val="24"/>
+        </w:rPr>
+      </w:pPr>
+      <w:r>
+        <w:rPr>
+          <w:rFonts w:cs="Times New Roman" w:ascii="Times New Roman" w:hAnsi="Times New Roman"/>
+          <w:b w:val="false"/>
+          <w:bCs w:val="false"/>
+          <w:sz w:val="24"/>
+          <w:szCs w:val="24"/>
+        </w:rPr>
+        <w:t>If any operand unready, continuously poll CDB. If a tag matches with any rs_tags, mark them ready</w:t>
+      </w:r>
+    </w:p>
+    <w:p>
+      <w:pPr>
+        <w:pStyle w:val="ListParagraph"/>
+        <w:numPr>
+          <w:ilvl w:val="1"/>
+          <w:numId w:val="13"/>
+        </w:numPr>
+        <w:rPr>
+          <w:b w:val="false"/>
+          <w:bCs w:val="false"/>
+          <w:sz w:val="24"/>
+          <w:szCs w:val="24"/>
+        </w:rPr>
+      </w:pPr>
+      <w:r>
+        <w:rPr>
+          <w:rFonts w:cs="Times New Roman" w:ascii="Times New Roman" w:hAnsi="Times New Roman"/>
+          <w:b w:val="false"/>
+          <w:bCs w:val="false"/>
+          <w:sz w:val="24"/>
+          <w:szCs w:val="24"/>
+        </w:rPr>
+        <w:t>When both operands ready for a given number of instructions, a priority encoder is used to an instruction which is ready, but has the smallest sqN, out of all the ready instructions</w:t>
+      </w:r>
+    </w:p>
+    <w:p>
+      <w:pPr>
+        <w:pStyle w:val="ListParagraph"/>
+        <w:numPr>
+          <w:ilvl w:val="1"/>
+          <w:numId w:val="13"/>
+        </w:numPr>
+        <w:rPr>
+          <w:b w:val="false"/>
+          <w:bCs w:val="false"/>
+          <w:sz w:val="24"/>
+          <w:szCs w:val="24"/>
+        </w:rPr>
+      </w:pPr>
+      <w:r>
+        <w:rPr>
+          <w:rFonts w:cs="Times New Roman" w:ascii="Times New Roman" w:hAnsi="Times New Roman"/>
+          <w:b w:val="false"/>
+          <w:bCs w:val="false"/>
+          <w:sz w:val="24"/>
+          <w:szCs w:val="24"/>
+        </w:rPr>
+        <w:t>The selected instruction’s rs_tags are read asynchronously from the register file, and op1, op2, oper, sqN, and rd_tag are forwarded from the buffers to their respective functional units</w:t>
+      </w:r>
+    </w:p>
+    <w:p>
+      <w:pPr>
+        <w:pStyle w:val="ListParagraph"/>
+        <w:numPr>
+          <w:ilvl w:val="1"/>
+          <w:numId w:val="13"/>
+        </w:numPr>
+        <w:rPr>
+          <w:b w:val="false"/>
+          <w:bCs w:val="false"/>
+          <w:sz w:val="24"/>
+          <w:szCs w:val="24"/>
+        </w:rPr>
+      </w:pPr>
+      <w:r>
+        <w:rPr>
+          <w:rFonts w:cs="Times New Roman" w:ascii="Times New Roman" w:hAnsi="Times New Roman"/>
+          <w:b w:val="false"/>
+          <w:bCs w:val="false"/>
+          <w:sz w:val="24"/>
+          <w:szCs w:val="24"/>
+        </w:rPr>
+        <w:t>ALU issue buffers serve some special purposes:</w:t>
+      </w:r>
+    </w:p>
+    <w:p>
+      <w:pPr>
+        <w:pStyle w:val="ListParagraph"/>
+        <w:numPr>
+          <w:ilvl w:val="2"/>
+          <w:numId w:val="13"/>
+        </w:numPr>
+        <w:rPr>
+          <w:b w:val="false"/>
+          <w:bCs w:val="false"/>
+          <w:sz w:val="24"/>
+          <w:szCs w:val="24"/>
+        </w:rPr>
+      </w:pPr>
+      <w:r>
+        <w:rPr>
+          <w:rFonts w:cs="Times New Roman" w:ascii="Times New Roman" w:hAnsi="Times New Roman"/>
+          <w:b w:val="false"/>
+          <w:bCs w:val="false"/>
+          <w:sz w:val="24"/>
+          <w:szCs w:val="24"/>
+        </w:rPr>
+        <w:t>For branch type instructions, it has its own comparator, which determines whether a branch is taken or not, once the operands are ready</w:t>
+      </w:r>
+    </w:p>
+    <w:p>
+      <w:pPr>
+        <w:pStyle w:val="ListParagraph"/>
+        <w:numPr>
+          <w:ilvl w:val="2"/>
+          <w:numId w:val="13"/>
+        </w:numPr>
+        <w:rPr>
+          <w:b w:val="false"/>
+          <w:bCs w:val="false"/>
+          <w:sz w:val="24"/>
+          <w:szCs w:val="24"/>
+        </w:rPr>
+      </w:pPr>
+      <w:r>
+        <w:rPr>
+          <w:rFonts w:cs="Times New Roman" w:ascii="Times New Roman" w:hAnsi="Times New Roman"/>
+          <w:b w:val="false"/>
+          <w:bCs w:val="false"/>
+          <w:sz w:val="24"/>
+          <w:szCs w:val="24"/>
+        </w:rPr>
+        <w:t>For jump type instructions (JAL and JALR), op1 and op2 are ready by default, since op1 = pc and op2 = immediate</w:t>
+      </w:r>
+    </w:p>
+    <w:p>
+      <w:pPr>
+        <w:pStyle w:val="ListParagraph"/>
+        <w:numPr>
+          <w:ilvl w:val="2"/>
+          <w:numId w:val="13"/>
+        </w:numPr>
+        <w:rPr>
+          <w:b w:val="false"/>
+          <w:bCs w:val="false"/>
+          <w:sz w:val="24"/>
+          <w:szCs w:val="24"/>
+        </w:rPr>
+      </w:pPr>
+      <w:r>
+        <w:rPr>
+          <w:rFonts w:cs="Times New Roman" w:ascii="Times New Roman" w:hAnsi="Times New Roman"/>
+          <w:b w:val="false"/>
+          <w:bCs w:val="false"/>
+          <w:sz w:val="24"/>
+          <w:szCs w:val="24"/>
+        </w:rPr>
+        <w:t>For immediate types, op2 is ready by default, since op2 = immediate</w:t>
+      </w:r>
+    </w:p>
+    <w:p>
+      <w:pPr>
+        <w:pStyle w:val="ListParagraph"/>
+        <w:numPr>
+          <w:ilvl w:val="2"/>
+          <w:numId w:val="13"/>
+        </w:numPr>
+        <w:rPr>
+          <w:b w:val="false"/>
+          <w:bCs w:val="false"/>
+          <w:sz w:val="24"/>
+          <w:szCs w:val="24"/>
+        </w:rPr>
+      </w:pPr>
+      <w:r>
+        <w:rPr>
+          <w:rFonts w:cs="Times New Roman" w:ascii="Times New Roman" w:hAnsi="Times New Roman"/>
+          <w:b w:val="false"/>
+          <w:bCs w:val="false"/>
+          <w:sz w:val="24"/>
+          <w:szCs w:val="24"/>
+        </w:rPr>
+        <w:t>For branch taken or JALR (is_imm = 1 and is_jump = 1), the relevant signals are sent to the flush controller and JTA2</w:t>
+      </w:r>
+    </w:p>
+    <w:p>
+      <w:pPr>
+        <w:pStyle w:val="ListParagraph"/>
+        <w:numPr>
+          <w:ilvl w:val="1"/>
+          <w:numId w:val="13"/>
+        </w:numPr>
+        <w:rPr>
+          <w:b w:val="false"/>
+          <w:bCs w:val="false"/>
+          <w:sz w:val="24"/>
+          <w:szCs w:val="24"/>
+        </w:rPr>
+      </w:pPr>
+      <w:r>
+        <w:rPr>
+          <w:rFonts w:cs="Times New Roman" w:ascii="Times New Roman" w:hAnsi="Times New Roman"/>
+          <w:b w:val="false"/>
+          <w:bCs w:val="false"/>
+          <w:sz w:val="24"/>
+          <w:szCs w:val="24"/>
+        </w:rPr>
+        <w:t>The flush controller generates a flush and flush_sqN signal, if the branch was taken. flush_sqN = sqN of branch/JALR instruction</w:t>
+      </w:r>
+    </w:p>
+    <w:p>
+      <w:pPr>
+        <w:pStyle w:val="ListParagraph"/>
+        <w:numPr>
+          <w:ilvl w:val="1"/>
+          <w:numId w:val="13"/>
+        </w:numPr>
+        <w:rPr>
+          <w:b w:val="false"/>
+          <w:bCs w:val="false"/>
+          <w:sz w:val="24"/>
+          <w:szCs w:val="24"/>
+        </w:rPr>
+      </w:pPr>
+      <w:r>
+        <w:rPr>
+          <w:rFonts w:cs="Times New Roman" w:ascii="Times New Roman" w:hAnsi="Times New Roman"/>
+          <w:b w:val="false"/>
+          <w:bCs w:val="false"/>
+          <w:sz w:val="24"/>
+          <w:szCs w:val="24"/>
+        </w:rPr>
+        <w:t>JTA2 computes the target address and jump2 signal</w:t>
+      </w:r>
+    </w:p>
+    <w:p>
+      <w:pPr>
+        <w:pStyle w:val="ListParagraph"/>
+        <w:numPr>
+          <w:ilvl w:val="1"/>
+          <w:numId w:val="13"/>
+        </w:numPr>
+        <w:rPr>
+          <w:b w:val="false"/>
+          <w:bCs w:val="false"/>
+          <w:sz w:val="24"/>
+          <w:szCs w:val="24"/>
+        </w:rPr>
+      </w:pPr>
+      <w:r>
+        <w:rPr>
+          <w:rFonts w:cs="Times New Roman" w:ascii="Times New Roman" w:hAnsi="Times New Roman"/>
+          <w:b w:val="false"/>
+          <w:bCs w:val="false"/>
+          <w:sz w:val="24"/>
+          <w:szCs w:val="24"/>
+        </w:rPr>
+        <w:t>Since both flush controller and JTA2 are combinational, their signals arrive at the destination before the next clock edge. Hence, in the next clock edge, data is flushed and target address is loaded by pc</w:t>
+      </w:r>
+    </w:p>
+    <w:p>
+      <w:pPr>
+        <w:pStyle w:val="ListParagraph"/>
+        <w:numPr>
+          <w:ilvl w:val="1"/>
+          <w:numId w:val="13"/>
+        </w:numPr>
+        <w:rPr>
+          <w:b w:val="false"/>
+          <w:bCs w:val="false"/>
+          <w:sz w:val="24"/>
+          <w:szCs w:val="24"/>
+        </w:rPr>
+      </w:pPr>
+      <w:r>
+        <w:rPr>
+          <w:rFonts w:cs="Times New Roman" w:ascii="Times New Roman" w:hAnsi="Times New Roman"/>
+          <w:b w:val="false"/>
+          <w:bCs w:val="false"/>
+          <w:sz w:val="24"/>
+          <w:szCs w:val="24"/>
+        </w:rPr>
+        <w:t>fetch_stall signal is also sent to JTA2, so that it maintains its signals JTA2 and jump2, until JTA2 is loaded into pc after the stall</w:t>
+      </w:r>
+    </w:p>
+    <w:p>
+      <w:pPr>
+        <w:pStyle w:val="ListParagraph"/>
+        <w:numPr>
+          <w:ilvl w:val="1"/>
+          <w:numId w:val="13"/>
+        </w:numPr>
+        <w:rPr>
+          <w:rFonts w:ascii="Times New Roman" w:hAnsi="Times New Roman"/>
+          <w:b/>
+          <w:bCs/>
+          <w:sz w:val="24"/>
+          <w:szCs w:val="24"/>
+        </w:rPr>
+      </w:pPr>
+      <w:r>
+        <w:rPr>
+          <w:rFonts w:ascii="Times New Roman" w:hAnsi="Times New Roman"/>
+          <w:b/>
+          <w:bCs/>
+          <w:sz w:val="24"/>
+          <w:szCs w:val="24"/>
+        </w:rPr>
+        <w:t xml:space="preserve">Special case: </w:t>
+      </w:r>
+      <w:r>
+        <w:rPr>
+          <w:rFonts w:ascii="Times New Roman" w:hAnsi="Times New Roman"/>
+          <w:b w:val="false"/>
+          <w:bCs w:val="false"/>
+          <w:sz w:val="24"/>
+          <w:szCs w:val="24"/>
+        </w:rPr>
+        <w:t xml:space="preserve">If both instructions from each ALU are branch taken or JALR, then the older one is given priority, </w:t>
+      </w:r>
+      <w:r>
+        <w:rPr>
+          <w:rFonts w:ascii="Times New Roman" w:hAnsi="Times New Roman"/>
+          <w:b w:val="false"/>
+          <w:bCs w:val="false"/>
+          <w:sz w:val="24"/>
+          <w:szCs w:val="24"/>
+        </w:rPr>
+        <w:t>by the flush controller and JTA2</w:t>
       </w:r>
     </w:p>
     <w:p>
@@ -4029,7 +4514,11 @@
         </w:rPr>
       </w:pPr>
       <w:r>
-        <w:rPr/>
+        <w:rPr>
+          <w:rFonts w:cs="Times New Roman" w:ascii="Times New Roman" w:hAnsi="Times New Roman"/>
+          <w:b/>
+          <w:sz w:val="32"/>
+        </w:rPr>
       </w:r>
     </w:p>
     <w:p>

</xml_diff>